<commit_message>
Lead report with "What moved this week"; add owner to that table
- Move the "What moved this week" section to the top of the report so it is
  the first thing leadership sees on the Tuesday call.
- Add a Sales owner column to the moved-deals table; deal hubspot_owner_id is
  now pulled and resolved to owner name (added to raw_input.json per deal).
</commit_message>
<xml_diff>
--- a/reports/2026-09-01.docx
+++ b/reports/2026-09-01.docx
@@ -71,7 +71,7 @@
           <w:iCs/>
           <w:i/>
         </w:rPr>
-        <w:t xml:space="preserve">for companies). Generated 2026-09-01 06:38:38 UTC from HubSpot. Deal values in USD (home currency).</w:t>
+        <w:t xml:space="preserve">for companies). Generated 2026-09-01 10:33:16 UTC from HubSpot. Deal values in USD (home currency).</w:t>
       </w:r>
     </w:p>
     <w:p>
@@ -101,7 +101,1541 @@
         <w:t xml:space="preserve">).</w:t>
       </w:r>
     </w:p>
-    <w:bookmarkStart w:id="24" w:name="alerts"/>
+    <w:bookmarkStart w:id="25" w:name="what-moved-this-week-7-day-view"/>
+    <w:p>
+      <w:pPr>
+        <w:pStyle w:val="Heading2"/>
+      </w:pPr>
+      <w:r>
+        <w:t xml:space="preserve">📈 What moved this week (7-day view)</w:t>
+      </w:r>
+    </w:p>
+    <w:p>
+      <w:pPr>
+        <w:pStyle w:val="FirstParagraph"/>
+      </w:pPr>
+      <w:r>
+        <w:t xml:space="preserve">The Tuesday leadership view: deals with a stage change, logged activity, or field update in the last 7 days. Grouped by current stage, highest USD value first. Stage-change vs field-update cannot always be separated without deal history, so the change column is best-effort.</w:t>
+      </w:r>
+    </w:p>
+    <w:p>
+      <w:pPr>
+        <w:pStyle w:val="BodyText"/>
+      </w:pPr>
+      <w:r>
+        <w:rPr>
+          <w:bCs/>
+          <w:b/>
+        </w:rPr>
+        <w:t xml:space="preserve">17 deal(s) active this week.</w:t>
+      </w:r>
+    </w:p>
+    <w:bookmarkStart w:id="20" w:name="qualified-to-buy-7-deals-120100-usd"/>
+    <w:p>
+      <w:pPr>
+        <w:pStyle w:val="Heading3"/>
+      </w:pPr>
+      <w:r>
+        <w:t xml:space="preserve">Qualified to Buy — 7 deal(s), 120,100 USD</w:t>
+      </w:r>
+    </w:p>
+    <w:tbl>
+      <w:tblPr>
+        <w:tblStyle w:val="Table"/>
+        <w:tblW w:type="pct" w:w="5000"/>
+        <w:tblLook w:firstRow="1" w:lastRow="0" w:firstColumn="0" w:lastColumn="0" w:noHBand="0" w:noVBand="0" w:val="0020"/>
+        <w:jc w:val="start"/>
+      </w:tblPr>
+      <w:tblGrid>
+        <w:gridCol w:w="896"/>
+        <w:gridCol w:w="1046"/>
+        <w:gridCol w:w="1643"/>
+        <w:gridCol w:w="2092"/>
+        <w:gridCol w:w="2241"/>
+      </w:tblGrid>
+      <w:tr>
+        <w:trPr>
+          <w:tblHeader w:val="true"/>
+        </w:trPr>
+        <w:tc>
+          <w:tcPr/>
+          <w:p>
+            <w:pPr>
+              <w:pStyle w:val="Compact"/>
+              <w:jc w:val="left"/>
+            </w:pPr>
+            <w:r>
+              <w:t xml:space="preserve">Deal</w:t>
+            </w:r>
+          </w:p>
+        </w:tc>
+        <w:tc>
+          <w:tcPr/>
+          <w:p>
+            <w:pPr>
+              <w:pStyle w:val="Compact"/>
+              <w:jc w:val="left"/>
+            </w:pPr>
+            <w:r>
+              <w:t xml:space="preserve">Owner</w:t>
+            </w:r>
+          </w:p>
+        </w:tc>
+        <w:tc>
+          <w:tcPr/>
+          <w:p>
+            <w:pPr>
+              <w:pStyle w:val="Compact"/>
+              <w:jc w:val="left"/>
+            </w:pPr>
+            <w:r>
+              <w:t xml:space="preserve">USD value</w:t>
+            </w:r>
+          </w:p>
+        </w:tc>
+        <w:tc>
+          <w:tcPr/>
+          <w:p>
+            <w:pPr>
+              <w:pStyle w:val="Compact"/>
+              <w:jc w:val="left"/>
+            </w:pPr>
+            <w:r>
+              <w:t xml:space="preserve">What changed</w:t>
+            </w:r>
+          </w:p>
+        </w:tc>
+        <w:tc>
+          <w:tcPr/>
+          <w:p>
+            <w:pPr>
+              <w:pStyle w:val="Compact"/>
+              <w:jc w:val="left"/>
+            </w:pPr>
+            <w:r>
+              <w:t xml:space="preserve">Last activity</w:t>
+            </w:r>
+          </w:p>
+        </w:tc>
+      </w:tr>
+      <w:tr>
+        <w:tc>
+          <w:tcPr/>
+          <w:p>
+            <w:pPr>
+              <w:pStyle w:val="Compact"/>
+              <w:jc w:val="left"/>
+            </w:pPr>
+            <w:r>
+              <w:t xml:space="preserve">Mopec - Custom VR Product SIM (#60019887668)</w:t>
+            </w:r>
+          </w:p>
+        </w:tc>
+        <w:tc>
+          <w:tcPr/>
+          <w:p>
+            <w:pPr>
+              <w:pStyle w:val="Compact"/>
+              <w:jc w:val="left"/>
+            </w:pPr>
+            <w:r>
+              <w:t xml:space="preserve">Jack Makhlouf</w:t>
+            </w:r>
+          </w:p>
+        </w:tc>
+        <w:tc>
+          <w:tcPr/>
+          <w:p>
+            <w:pPr>
+              <w:pStyle w:val="Compact"/>
+              <w:jc w:val="left"/>
+            </w:pPr>
+            <w:r>
+              <w:t xml:space="preserve">90,000</w:t>
+            </w:r>
+          </w:p>
+        </w:tc>
+        <w:tc>
+          <w:tcPr/>
+          <w:p>
+            <w:pPr>
+              <w:pStyle w:val="Compact"/>
+              <w:jc w:val="left"/>
+            </w:pPr>
+            <w:r>
+              <w:t xml:space="preserve">activity + record update</w:t>
+            </w:r>
+          </w:p>
+        </w:tc>
+        <w:tc>
+          <w:tcPr/>
+          <w:p>
+            <w:pPr>
+              <w:pStyle w:val="Compact"/>
+              <w:jc w:val="left"/>
+            </w:pPr>
+            <w:r>
+              <w:t xml:space="preserve">2026-08-27 (4d ago)</w:t>
+            </w:r>
+          </w:p>
+        </w:tc>
+      </w:tr>
+      <w:tr>
+        <w:tc>
+          <w:tcPr/>
+          <w:p>
+            <w:pPr>
+              <w:pStyle w:val="Compact"/>
+              <w:jc w:val="left"/>
+            </w:pPr>
+            <w:r>
+              <w:t xml:space="preserve">Wellstar Hospital Network (#63701350283)</w:t>
+            </w:r>
+          </w:p>
+        </w:tc>
+        <w:tc>
+          <w:tcPr/>
+          <w:p>
+            <w:pPr>
+              <w:pStyle w:val="Compact"/>
+              <w:jc w:val="left"/>
+            </w:pPr>
+            <w:r>
+              <w:t xml:space="preserve">Jack Makhlouf</w:t>
+            </w:r>
+          </w:p>
+        </w:tc>
+        <w:tc>
+          <w:tcPr/>
+          <w:p>
+            <w:pPr>
+              <w:pStyle w:val="Compact"/>
+              <w:jc w:val="left"/>
+            </w:pPr>
+            <w:r>
+              <w:t xml:space="preserve">25,000</w:t>
+            </w:r>
+          </w:p>
+        </w:tc>
+        <w:tc>
+          <w:tcPr/>
+          <w:p>
+            <w:pPr>
+              <w:pStyle w:val="Compact"/>
+              <w:jc w:val="left"/>
+            </w:pPr>
+            <w:r>
+              <w:t xml:space="preserve">activity + record update</w:t>
+            </w:r>
+          </w:p>
+        </w:tc>
+        <w:tc>
+          <w:tcPr/>
+          <w:p>
+            <w:pPr>
+              <w:pStyle w:val="Compact"/>
+              <w:jc w:val="left"/>
+            </w:pPr>
+            <w:r>
+              <w:t xml:space="preserve">2026-09-01 (0d ago)</w:t>
+            </w:r>
+          </w:p>
+        </w:tc>
+      </w:tr>
+      <w:tr>
+        <w:tc>
+          <w:tcPr/>
+          <w:p>
+            <w:pPr>
+              <w:pStyle w:val="Compact"/>
+              <w:jc w:val="left"/>
+            </w:pPr>
+            <w:r>
+              <w:t xml:space="preserve">(AC) Nnamdi Azikiwe University / New Deal (#59610029666)</w:t>
+            </w:r>
+          </w:p>
+        </w:tc>
+        <w:tc>
+          <w:tcPr/>
+          <w:p>
+            <w:pPr>
+              <w:pStyle w:val="Compact"/>
+              <w:jc w:val="left"/>
+            </w:pPr>
+            <w:r>
+              <w:t xml:space="preserve">Theo Zirogiannis</w:t>
+            </w:r>
+          </w:p>
+        </w:tc>
+        <w:tc>
+          <w:tcPr/>
+          <w:p>
+            <w:pPr>
+              <w:pStyle w:val="Compact"/>
+              <w:jc w:val="left"/>
+            </w:pPr>
+            <w:r>
+              <w:t xml:space="preserve">5,100</w:t>
+            </w:r>
+          </w:p>
+        </w:tc>
+        <w:tc>
+          <w:tcPr/>
+          <w:p>
+            <w:pPr>
+              <w:pStyle w:val="Compact"/>
+              <w:jc w:val="left"/>
+            </w:pPr>
+            <w:r>
+              <w:t xml:space="preserve">field/stage update (no new activity)</w:t>
+            </w:r>
+          </w:p>
+        </w:tc>
+        <w:tc>
+          <w:tcPr/>
+          <w:p>
+            <w:pPr>
+              <w:pStyle w:val="Compact"/>
+              <w:jc w:val="left"/>
+            </w:pPr>
+            <w:r>
+              <w:t xml:space="preserve">2026-06-24 (68d ago)</w:t>
+            </w:r>
+          </w:p>
+        </w:tc>
+      </w:tr>
+      <w:tr>
+        <w:tc>
+          <w:tcPr/>
+          <w:p>
+            <w:pPr>
+              <w:pStyle w:val="Compact"/>
+              <w:jc w:val="left"/>
+            </w:pPr>
+            <w:r>
+              <w:t xml:space="preserve">(Pilot HAPS) -University of Mississippi - Ole Miss (#60786237714)</w:t>
+            </w:r>
+          </w:p>
+        </w:tc>
+        <w:tc>
+          <w:tcPr/>
+          <w:p>
+            <w:pPr>
+              <w:pStyle w:val="Compact"/>
+              <w:jc w:val="left"/>
+            </w:pPr>
+            <w:r>
+              <w:t xml:space="preserve">Jack Makhlouf</w:t>
+            </w:r>
+          </w:p>
+        </w:tc>
+        <w:tc>
+          <w:tcPr/>
+          <w:p>
+            <w:pPr>
+              <w:pStyle w:val="Compact"/>
+              <w:jc w:val="left"/>
+            </w:pPr>
+            <w:r>
+              <w:t xml:space="preserve">0</w:t>
+            </w:r>
+          </w:p>
+        </w:tc>
+        <w:tc>
+          <w:tcPr/>
+          <w:p>
+            <w:pPr>
+              <w:pStyle w:val="Compact"/>
+              <w:jc w:val="left"/>
+            </w:pPr>
+            <w:r>
+              <w:t xml:space="preserve">activity + record update</w:t>
+            </w:r>
+          </w:p>
+        </w:tc>
+        <w:tc>
+          <w:tcPr/>
+          <w:p>
+            <w:pPr>
+              <w:pStyle w:val="Compact"/>
+              <w:jc w:val="left"/>
+            </w:pPr>
+            <w:r>
+              <w:t xml:space="preserve">2026-09-01 (0d ago)</w:t>
+            </w:r>
+          </w:p>
+        </w:tc>
+      </w:tr>
+      <w:tr>
+        <w:tc>
+          <w:tcPr/>
+          <w:p>
+            <w:pPr>
+              <w:pStyle w:val="Compact"/>
+              <w:jc w:val="left"/>
+            </w:pPr>
+            <w:r>
+              <w:t xml:space="preserve">(Pilot HAPS) - University of Detroit Mercy (#60785744196)</w:t>
+            </w:r>
+          </w:p>
+        </w:tc>
+        <w:tc>
+          <w:tcPr/>
+          <w:p>
+            <w:pPr>
+              <w:pStyle w:val="Compact"/>
+              <w:jc w:val="left"/>
+            </w:pPr>
+            <w:r>
+              <w:t xml:space="preserve">Jack Makhlouf</w:t>
+            </w:r>
+          </w:p>
+        </w:tc>
+        <w:tc>
+          <w:tcPr/>
+          <w:p>
+            <w:pPr>
+              <w:pStyle w:val="Compact"/>
+              <w:jc w:val="left"/>
+            </w:pPr>
+            <w:r>
+              <w:t xml:space="preserve">0</w:t>
+            </w:r>
+          </w:p>
+        </w:tc>
+        <w:tc>
+          <w:tcPr/>
+          <w:p>
+            <w:pPr>
+              <w:pStyle w:val="Compact"/>
+              <w:jc w:val="left"/>
+            </w:pPr>
+            <w:r>
+              <w:t xml:space="preserve">activity + record update</w:t>
+            </w:r>
+          </w:p>
+        </w:tc>
+        <w:tc>
+          <w:tcPr/>
+          <w:p>
+            <w:pPr>
+              <w:pStyle w:val="Compact"/>
+              <w:jc w:val="left"/>
+            </w:pPr>
+            <w:r>
+              <w:t xml:space="preserve">2026-09-01 (0d ago)</w:t>
+            </w:r>
+          </w:p>
+        </w:tc>
+      </w:tr>
+      <w:tr>
+        <w:tc>
+          <w:tcPr/>
+          <w:p>
+            <w:pPr>
+              <w:pStyle w:val="Compact"/>
+              <w:jc w:val="left"/>
+            </w:pPr>
+            <w:r>
+              <w:t xml:space="preserve">(Pilot HAPS) Bluegrass Community &amp; Technical College (#60644345390)</w:t>
+            </w:r>
+          </w:p>
+        </w:tc>
+        <w:tc>
+          <w:tcPr/>
+          <w:p>
+            <w:pPr>
+              <w:pStyle w:val="Compact"/>
+              <w:jc w:val="left"/>
+            </w:pPr>
+            <w:r>
+              <w:t xml:space="preserve">Jack Makhlouf</w:t>
+            </w:r>
+          </w:p>
+        </w:tc>
+        <w:tc>
+          <w:tcPr/>
+          <w:p>
+            <w:pPr>
+              <w:pStyle w:val="Compact"/>
+              <w:jc w:val="left"/>
+            </w:pPr>
+            <w:r>
+              <w:t xml:space="preserve">0</w:t>
+            </w:r>
+          </w:p>
+        </w:tc>
+        <w:tc>
+          <w:tcPr/>
+          <w:p>
+            <w:pPr>
+              <w:pStyle w:val="Compact"/>
+              <w:jc w:val="left"/>
+            </w:pPr>
+            <w:r>
+              <w:t xml:space="preserve">activity + record update</w:t>
+            </w:r>
+          </w:p>
+        </w:tc>
+        <w:tc>
+          <w:tcPr/>
+          <w:p>
+            <w:pPr>
+              <w:pStyle w:val="Compact"/>
+              <w:jc w:val="left"/>
+            </w:pPr>
+            <w:r>
+              <w:t xml:space="preserve">2026-09-01 (0d ago)</w:t>
+            </w:r>
+          </w:p>
+        </w:tc>
+      </w:tr>
+      <w:tr>
+        <w:tc>
+          <w:tcPr/>
+          <w:p>
+            <w:pPr>
+              <w:pStyle w:val="Compact"/>
+              <w:jc w:val="left"/>
+            </w:pPr>
+            <w:r>
+              <w:t xml:space="preserve">(Pilot HAPS) UTSA - The University of Texas at San Antonio (#60182264878)</w:t>
+            </w:r>
+          </w:p>
+        </w:tc>
+        <w:tc>
+          <w:tcPr/>
+          <w:p>
+            <w:pPr>
+              <w:pStyle w:val="Compact"/>
+              <w:jc w:val="left"/>
+            </w:pPr>
+            <w:r>
+              <w:t xml:space="preserve">Jack Makhlouf</w:t>
+            </w:r>
+          </w:p>
+        </w:tc>
+        <w:tc>
+          <w:tcPr/>
+          <w:p>
+            <w:pPr>
+              <w:pStyle w:val="Compact"/>
+              <w:jc w:val="left"/>
+            </w:pPr>
+            <w:r>
+              <w:t xml:space="preserve">0</w:t>
+            </w:r>
+          </w:p>
+        </w:tc>
+        <w:tc>
+          <w:tcPr/>
+          <w:p>
+            <w:pPr>
+              <w:pStyle w:val="Compact"/>
+              <w:jc w:val="left"/>
+            </w:pPr>
+            <w:r>
+              <w:t xml:space="preserve">activity + record update</w:t>
+            </w:r>
+          </w:p>
+        </w:tc>
+        <w:tc>
+          <w:tcPr/>
+          <w:p>
+            <w:pPr>
+              <w:pStyle w:val="Compact"/>
+              <w:jc w:val="left"/>
+            </w:pPr>
+            <w:r>
+              <w:t xml:space="preserve">2026-09-01 (0d ago)</w:t>
+            </w:r>
+          </w:p>
+        </w:tc>
+      </w:tr>
+    </w:tbl>
+    <w:bookmarkEnd w:id="20"/>
+    <w:bookmarkStart w:id="21" w:name="closed-won-1-deals-18000-usd"/>
+    <w:p>
+      <w:pPr>
+        <w:pStyle w:val="Heading3"/>
+      </w:pPr>
+      <w:r>
+        <w:t xml:space="preserve">Closed Won — 1 deal(s), 18,000 USD</w:t>
+      </w:r>
+    </w:p>
+    <w:tbl>
+      <w:tblPr>
+        <w:tblStyle w:val="Table"/>
+        <w:tblW w:type="pct" w:w="5000"/>
+        <w:tblLook w:firstRow="1" w:lastRow="0" w:firstColumn="0" w:lastColumn="0" w:noHBand="0" w:noVBand="0" w:val="0020"/>
+        <w:jc w:val="start"/>
+      </w:tblPr>
+      <w:tblGrid>
+        <w:gridCol w:w="896"/>
+        <w:gridCol w:w="1046"/>
+        <w:gridCol w:w="1643"/>
+        <w:gridCol w:w="2092"/>
+        <w:gridCol w:w="2241"/>
+      </w:tblGrid>
+      <w:tr>
+        <w:trPr>
+          <w:tblHeader w:val="true"/>
+        </w:trPr>
+        <w:tc>
+          <w:tcPr/>
+          <w:p>
+            <w:pPr>
+              <w:pStyle w:val="Compact"/>
+              <w:jc w:val="left"/>
+            </w:pPr>
+            <w:r>
+              <w:t xml:space="preserve">Deal</w:t>
+            </w:r>
+          </w:p>
+        </w:tc>
+        <w:tc>
+          <w:tcPr/>
+          <w:p>
+            <w:pPr>
+              <w:pStyle w:val="Compact"/>
+              <w:jc w:val="left"/>
+            </w:pPr>
+            <w:r>
+              <w:t xml:space="preserve">Owner</w:t>
+            </w:r>
+          </w:p>
+        </w:tc>
+        <w:tc>
+          <w:tcPr/>
+          <w:p>
+            <w:pPr>
+              <w:pStyle w:val="Compact"/>
+              <w:jc w:val="left"/>
+            </w:pPr>
+            <w:r>
+              <w:t xml:space="preserve">USD value</w:t>
+            </w:r>
+          </w:p>
+        </w:tc>
+        <w:tc>
+          <w:tcPr/>
+          <w:p>
+            <w:pPr>
+              <w:pStyle w:val="Compact"/>
+              <w:jc w:val="left"/>
+            </w:pPr>
+            <w:r>
+              <w:t xml:space="preserve">What changed</w:t>
+            </w:r>
+          </w:p>
+        </w:tc>
+        <w:tc>
+          <w:tcPr/>
+          <w:p>
+            <w:pPr>
+              <w:pStyle w:val="Compact"/>
+              <w:jc w:val="left"/>
+            </w:pPr>
+            <w:r>
+              <w:t xml:space="preserve">Last activity</w:t>
+            </w:r>
+          </w:p>
+        </w:tc>
+      </w:tr>
+      <w:tr>
+        <w:tc>
+          <w:tcPr/>
+          <w:p>
+            <w:pPr>
+              <w:pStyle w:val="Compact"/>
+              <w:jc w:val="left"/>
+            </w:pPr>
+            <w:r>
+              <w:t xml:space="preserve">Dean College - New Deal / Anatomy 360 &amp; Digital Cadaver / 36 month subscription (#56896693933)</w:t>
+            </w:r>
+          </w:p>
+        </w:tc>
+        <w:tc>
+          <w:tcPr/>
+          <w:p>
+            <w:pPr>
+              <w:pStyle w:val="Compact"/>
+              <w:jc w:val="left"/>
+            </w:pPr>
+            <w:r>
+              <w:t xml:space="preserve">Theo Zirogiannis</w:t>
+            </w:r>
+          </w:p>
+        </w:tc>
+        <w:tc>
+          <w:tcPr/>
+          <w:p>
+            <w:pPr>
+              <w:pStyle w:val="Compact"/>
+              <w:jc w:val="left"/>
+            </w:pPr>
+            <w:r>
+              <w:t xml:space="preserve">18,000</w:t>
+            </w:r>
+          </w:p>
+        </w:tc>
+        <w:tc>
+          <w:tcPr/>
+          <w:p>
+            <w:pPr>
+              <w:pStyle w:val="Compact"/>
+              <w:jc w:val="left"/>
+            </w:pPr>
+            <w:r>
+              <w:t xml:space="preserve">field/stage update (no new activity)</w:t>
+            </w:r>
+          </w:p>
+        </w:tc>
+        <w:tc>
+          <w:tcPr/>
+          <w:p>
+            <w:pPr>
+              <w:pStyle w:val="Compact"/>
+              <w:jc w:val="left"/>
+            </w:pPr>
+            <w:r>
+              <w:t xml:space="preserve">2026-07-07 (55d ago)</w:t>
+            </w:r>
+          </w:p>
+        </w:tc>
+      </w:tr>
+    </w:tbl>
+    <w:bookmarkEnd w:id="21"/>
+    <w:bookmarkStart w:id="22" w:name="quote-sent-1-deals-9000-usd"/>
+    <w:p>
+      <w:pPr>
+        <w:pStyle w:val="Heading3"/>
+      </w:pPr>
+      <w:r>
+        <w:t xml:space="preserve">Quote Sent — 1 deal(s), 9,000 USD</w:t>
+      </w:r>
+    </w:p>
+    <w:tbl>
+      <w:tblPr>
+        <w:tblStyle w:val="Table"/>
+        <w:tblW w:type="pct" w:w="5000"/>
+        <w:tblLook w:firstRow="1" w:lastRow="0" w:firstColumn="0" w:lastColumn="0" w:noHBand="0" w:noVBand="0" w:val="0020"/>
+        <w:jc w:val="start"/>
+      </w:tblPr>
+      <w:tblGrid>
+        <w:gridCol w:w="896"/>
+        <w:gridCol w:w="1046"/>
+        <w:gridCol w:w="1643"/>
+        <w:gridCol w:w="2092"/>
+        <w:gridCol w:w="2241"/>
+      </w:tblGrid>
+      <w:tr>
+        <w:trPr>
+          <w:tblHeader w:val="true"/>
+        </w:trPr>
+        <w:tc>
+          <w:tcPr/>
+          <w:p>
+            <w:pPr>
+              <w:pStyle w:val="Compact"/>
+              <w:jc w:val="left"/>
+            </w:pPr>
+            <w:r>
+              <w:t xml:space="preserve">Deal</w:t>
+            </w:r>
+          </w:p>
+        </w:tc>
+        <w:tc>
+          <w:tcPr/>
+          <w:p>
+            <w:pPr>
+              <w:pStyle w:val="Compact"/>
+              <w:jc w:val="left"/>
+            </w:pPr>
+            <w:r>
+              <w:t xml:space="preserve">Owner</w:t>
+            </w:r>
+          </w:p>
+        </w:tc>
+        <w:tc>
+          <w:tcPr/>
+          <w:p>
+            <w:pPr>
+              <w:pStyle w:val="Compact"/>
+              <w:jc w:val="left"/>
+            </w:pPr>
+            <w:r>
+              <w:t xml:space="preserve">USD value</w:t>
+            </w:r>
+          </w:p>
+        </w:tc>
+        <w:tc>
+          <w:tcPr/>
+          <w:p>
+            <w:pPr>
+              <w:pStyle w:val="Compact"/>
+              <w:jc w:val="left"/>
+            </w:pPr>
+            <w:r>
+              <w:t xml:space="preserve">What changed</w:t>
+            </w:r>
+          </w:p>
+        </w:tc>
+        <w:tc>
+          <w:tcPr/>
+          <w:p>
+            <w:pPr>
+              <w:pStyle w:val="Compact"/>
+              <w:jc w:val="left"/>
+            </w:pPr>
+            <w:r>
+              <w:t xml:space="preserve">Last activity</w:t>
+            </w:r>
+          </w:p>
+        </w:tc>
+      </w:tr>
+      <w:tr>
+        <w:tc>
+          <w:tcPr/>
+          <w:p>
+            <w:pPr>
+              <w:pStyle w:val="Compact"/>
+              <w:jc w:val="left"/>
+            </w:pPr>
+            <w:r>
+              <w:t xml:space="preserve">(License) Klamath Community College (#59644501846)</w:t>
+            </w:r>
+          </w:p>
+        </w:tc>
+        <w:tc>
+          <w:tcPr/>
+          <w:p>
+            <w:pPr>
+              <w:pStyle w:val="Compact"/>
+              <w:jc w:val="left"/>
+            </w:pPr>
+            <w:r>
+              <w:t xml:space="preserve">Jack Makhlouf</w:t>
+            </w:r>
+          </w:p>
+        </w:tc>
+        <w:tc>
+          <w:tcPr/>
+          <w:p>
+            <w:pPr>
+              <w:pStyle w:val="Compact"/>
+              <w:jc w:val="left"/>
+            </w:pPr>
+            <w:r>
+              <w:t xml:space="preserve">9,000</w:t>
+            </w:r>
+          </w:p>
+        </w:tc>
+        <w:tc>
+          <w:tcPr/>
+          <w:p>
+            <w:pPr>
+              <w:pStyle w:val="Compact"/>
+              <w:jc w:val="left"/>
+            </w:pPr>
+            <w:r>
+              <w:t xml:space="preserve">activity + record update</w:t>
+            </w:r>
+          </w:p>
+        </w:tc>
+        <w:tc>
+          <w:tcPr/>
+          <w:p>
+            <w:pPr>
+              <w:pStyle w:val="Compact"/>
+              <w:jc w:val="left"/>
+            </w:pPr>
+            <w:r>
+              <w:t xml:space="preserve">2026-09-01 (0d ago)</w:t>
+            </w:r>
+          </w:p>
+        </w:tc>
+      </w:tr>
+    </w:tbl>
+    <w:bookmarkEnd w:id="22"/>
+    <w:bookmarkStart w:id="23" w:name="discovery-trial-6-deals-9000-usd"/>
+    <w:p>
+      <w:pPr>
+        <w:pStyle w:val="Heading3"/>
+      </w:pPr>
+      <w:r>
+        <w:t xml:space="preserve">Discovery &amp; Trial — 6 deal(s), 9,000 USD</w:t>
+      </w:r>
+    </w:p>
+    <w:tbl>
+      <w:tblPr>
+        <w:tblStyle w:val="Table"/>
+        <w:tblW w:type="pct" w:w="5000"/>
+        <w:tblLook w:firstRow="1" w:lastRow="0" w:firstColumn="0" w:lastColumn="0" w:noHBand="0" w:noVBand="0" w:val="0020"/>
+        <w:jc w:val="start"/>
+      </w:tblPr>
+      <w:tblGrid>
+        <w:gridCol w:w="896"/>
+        <w:gridCol w:w="1046"/>
+        <w:gridCol w:w="1643"/>
+        <w:gridCol w:w="2092"/>
+        <w:gridCol w:w="2241"/>
+      </w:tblGrid>
+      <w:tr>
+        <w:trPr>
+          <w:tblHeader w:val="true"/>
+        </w:trPr>
+        <w:tc>
+          <w:tcPr/>
+          <w:p>
+            <w:pPr>
+              <w:pStyle w:val="Compact"/>
+              <w:jc w:val="left"/>
+            </w:pPr>
+            <w:r>
+              <w:t xml:space="preserve">Deal</w:t>
+            </w:r>
+          </w:p>
+        </w:tc>
+        <w:tc>
+          <w:tcPr/>
+          <w:p>
+            <w:pPr>
+              <w:pStyle w:val="Compact"/>
+              <w:jc w:val="left"/>
+            </w:pPr>
+            <w:r>
+              <w:t xml:space="preserve">Owner</w:t>
+            </w:r>
+          </w:p>
+        </w:tc>
+        <w:tc>
+          <w:tcPr/>
+          <w:p>
+            <w:pPr>
+              <w:pStyle w:val="Compact"/>
+              <w:jc w:val="left"/>
+            </w:pPr>
+            <w:r>
+              <w:t xml:space="preserve">USD value</w:t>
+            </w:r>
+          </w:p>
+        </w:tc>
+        <w:tc>
+          <w:tcPr/>
+          <w:p>
+            <w:pPr>
+              <w:pStyle w:val="Compact"/>
+              <w:jc w:val="left"/>
+            </w:pPr>
+            <w:r>
+              <w:t xml:space="preserve">What changed</w:t>
+            </w:r>
+          </w:p>
+        </w:tc>
+        <w:tc>
+          <w:tcPr/>
+          <w:p>
+            <w:pPr>
+              <w:pStyle w:val="Compact"/>
+              <w:jc w:val="left"/>
+            </w:pPr>
+            <w:r>
+              <w:t xml:space="preserve">Last activity</w:t>
+            </w:r>
+          </w:p>
+        </w:tc>
+      </w:tr>
+      <w:tr>
+        <w:tc>
+          <w:tcPr/>
+          <w:p>
+            <w:pPr>
+              <w:pStyle w:val="Compact"/>
+              <w:jc w:val="left"/>
+            </w:pPr>
+            <w:r>
+              <w:t xml:space="preserve">(License) UC San Diego Medical (#59680085122)</w:t>
+            </w:r>
+          </w:p>
+        </w:tc>
+        <w:tc>
+          <w:tcPr/>
+          <w:p>
+            <w:pPr>
+              <w:pStyle w:val="Compact"/>
+              <w:jc w:val="left"/>
+            </w:pPr>
+            <w:r>
+              <w:t xml:space="preserve">Jack Makhlouf</w:t>
+            </w:r>
+          </w:p>
+        </w:tc>
+        <w:tc>
+          <w:tcPr/>
+          <w:p>
+            <w:pPr>
+              <w:pStyle w:val="Compact"/>
+              <w:jc w:val="left"/>
+            </w:pPr>
+            <w:r>
+              <w:t xml:space="preserve">9,000</w:t>
+            </w:r>
+          </w:p>
+        </w:tc>
+        <w:tc>
+          <w:tcPr/>
+          <w:p>
+            <w:pPr>
+              <w:pStyle w:val="Compact"/>
+              <w:jc w:val="left"/>
+            </w:pPr>
+            <w:r>
+              <w:t xml:space="preserve">activity + record update</w:t>
+            </w:r>
+          </w:p>
+        </w:tc>
+        <w:tc>
+          <w:tcPr/>
+          <w:p>
+            <w:pPr>
+              <w:pStyle w:val="Compact"/>
+              <w:jc w:val="left"/>
+            </w:pPr>
+            <w:r>
+              <w:t xml:space="preserve">2026-08-26 (5d ago)</w:t>
+            </w:r>
+          </w:p>
+        </w:tc>
+      </w:tr>
+      <w:tr>
+        <w:tc>
+          <w:tcPr/>
+          <w:p>
+            <w:pPr>
+              <w:pStyle w:val="Compact"/>
+              <w:jc w:val="left"/>
+            </w:pPr>
+            <w:r>
+              <w:t xml:space="preserve">Royal National Orthopaedic Hospital / Dr.Boyne BELLEW- New Deal (#62115451054)</w:t>
+            </w:r>
+          </w:p>
+        </w:tc>
+        <w:tc>
+          <w:tcPr/>
+          <w:p>
+            <w:pPr>
+              <w:pStyle w:val="Compact"/>
+              <w:jc w:val="left"/>
+            </w:pPr>
+            <w:r>
+              <w:t xml:space="preserve">Theo Zirogiannis</w:t>
+            </w:r>
+          </w:p>
+        </w:tc>
+        <w:tc>
+          <w:tcPr/>
+          <w:p>
+            <w:pPr>
+              <w:pStyle w:val="Compact"/>
+              <w:jc w:val="left"/>
+            </w:pPr>
+            <w:r>
+              <w:t xml:space="preserve">0</w:t>
+            </w:r>
+          </w:p>
+        </w:tc>
+        <w:tc>
+          <w:tcPr/>
+          <w:p>
+            <w:pPr>
+              <w:pStyle w:val="Compact"/>
+              <w:jc w:val="left"/>
+            </w:pPr>
+            <w:r>
+              <w:t xml:space="preserve">field/stage update (no new activity)</w:t>
+            </w:r>
+          </w:p>
+        </w:tc>
+        <w:tc>
+          <w:tcPr/>
+          <w:p>
+            <w:pPr>
+              <w:pStyle w:val="Compact"/>
+              <w:jc w:val="left"/>
+            </w:pPr>
+            <w:r>
+              <w:t xml:space="preserve">2026-07-16 (46d ago)</w:t>
+            </w:r>
+          </w:p>
+        </w:tc>
+      </w:tr>
+      <w:tr>
+        <w:tc>
+          <w:tcPr/>
+          <w:p>
+            <w:pPr>
+              <w:pStyle w:val="Compact"/>
+              <w:jc w:val="left"/>
+            </w:pPr>
+            <w:r>
+              <w:t xml:space="preserve">Uniformed Services University of the Health Sciences (USU) - New Deal (#61390460829)</w:t>
+            </w:r>
+          </w:p>
+        </w:tc>
+        <w:tc>
+          <w:tcPr/>
+          <w:p>
+            <w:pPr>
+              <w:pStyle w:val="Compact"/>
+              <w:jc w:val="left"/>
+            </w:pPr>
+            <w:r>
+              <w:t xml:space="preserve">Theo Zirogiannis</w:t>
+            </w:r>
+          </w:p>
+        </w:tc>
+        <w:tc>
+          <w:tcPr/>
+          <w:p>
+            <w:pPr>
+              <w:pStyle w:val="Compact"/>
+              <w:jc w:val="left"/>
+            </w:pPr>
+            <w:r>
+              <w:t xml:space="preserve">0</w:t>
+            </w:r>
+          </w:p>
+        </w:tc>
+        <w:tc>
+          <w:tcPr/>
+          <w:p>
+            <w:pPr>
+              <w:pStyle w:val="Compact"/>
+              <w:jc w:val="left"/>
+            </w:pPr>
+            <w:r>
+              <w:t xml:space="preserve">activity + record update</w:t>
+            </w:r>
+          </w:p>
+        </w:tc>
+        <w:tc>
+          <w:tcPr/>
+          <w:p>
+            <w:pPr>
+              <w:pStyle w:val="Compact"/>
+              <w:jc w:val="left"/>
+            </w:pPr>
+            <w:r>
+              <w:t xml:space="preserve">2026-08-27 (4d ago)</w:t>
+            </w:r>
+          </w:p>
+        </w:tc>
+      </w:tr>
+      <w:tr>
+        <w:tc>
+          <w:tcPr/>
+          <w:p>
+            <w:pPr>
+              <w:pStyle w:val="Compact"/>
+              <w:jc w:val="left"/>
+            </w:pPr>
+            <w:r>
+              <w:t xml:space="preserve">(Pilot HAPS) Vincennes University (#60650552119)</w:t>
+            </w:r>
+          </w:p>
+        </w:tc>
+        <w:tc>
+          <w:tcPr/>
+          <w:p>
+            <w:pPr>
+              <w:pStyle w:val="Compact"/>
+              <w:jc w:val="left"/>
+            </w:pPr>
+            <w:r>
+              <w:t xml:space="preserve">Jack Makhlouf</w:t>
+            </w:r>
+          </w:p>
+        </w:tc>
+        <w:tc>
+          <w:tcPr/>
+          <w:p>
+            <w:pPr>
+              <w:pStyle w:val="Compact"/>
+              <w:jc w:val="left"/>
+            </w:pPr>
+            <w:r>
+              <w:t xml:space="preserve">0</w:t>
+            </w:r>
+          </w:p>
+        </w:tc>
+        <w:tc>
+          <w:tcPr/>
+          <w:p>
+            <w:pPr>
+              <w:pStyle w:val="Compact"/>
+              <w:jc w:val="left"/>
+            </w:pPr>
+            <w:r>
+              <w:t xml:space="preserve">activity + record update</w:t>
+            </w:r>
+          </w:p>
+        </w:tc>
+        <w:tc>
+          <w:tcPr/>
+          <w:p>
+            <w:pPr>
+              <w:pStyle w:val="Compact"/>
+              <w:jc w:val="left"/>
+            </w:pPr>
+            <w:r>
+              <w:t xml:space="preserve">2026-09-01 (0d ago)</w:t>
+            </w:r>
+          </w:p>
+        </w:tc>
+      </w:tr>
+      <w:tr>
+        <w:tc>
+          <w:tcPr/>
+          <w:p>
+            <w:pPr>
+              <w:pStyle w:val="Compact"/>
+              <w:jc w:val="left"/>
+            </w:pPr>
+            <w:r>
+              <w:t xml:space="preserve">(AC) University of Miami (#59729814549)</w:t>
+            </w:r>
+          </w:p>
+        </w:tc>
+        <w:tc>
+          <w:tcPr/>
+          <w:p>
+            <w:pPr>
+              <w:pStyle w:val="Compact"/>
+              <w:jc w:val="left"/>
+            </w:pPr>
+            <w:r>
+              <w:t xml:space="preserve">Jack Makhlouf</w:t>
+            </w:r>
+          </w:p>
+        </w:tc>
+        <w:tc>
+          <w:tcPr/>
+          <w:p>
+            <w:pPr>
+              <w:pStyle w:val="Compact"/>
+              <w:jc w:val="left"/>
+            </w:pPr>
+            <w:r>
+              <w:t xml:space="preserve">0</w:t>
+            </w:r>
+          </w:p>
+        </w:tc>
+        <w:tc>
+          <w:tcPr/>
+          <w:p>
+            <w:pPr>
+              <w:pStyle w:val="Compact"/>
+              <w:jc w:val="left"/>
+            </w:pPr>
+            <w:r>
+              <w:t xml:space="preserve">activity + record update</w:t>
+            </w:r>
+          </w:p>
+        </w:tc>
+        <w:tc>
+          <w:tcPr/>
+          <w:p>
+            <w:pPr>
+              <w:pStyle w:val="Compact"/>
+              <w:jc w:val="left"/>
+            </w:pPr>
+            <w:r>
+              <w:t xml:space="preserve">2026-09-01 (0d ago)</w:t>
+            </w:r>
+          </w:p>
+        </w:tc>
+      </w:tr>
+      <w:tr>
+        <w:tc>
+          <w:tcPr/>
+          <w:p>
+            <w:pPr>
+              <w:pStyle w:val="Compact"/>
+              <w:jc w:val="left"/>
+            </w:pPr>
+            <w:r>
+              <w:t xml:space="preserve">Univ Miami Bascom Eye Institute (#55031048968)</w:t>
+            </w:r>
+          </w:p>
+        </w:tc>
+        <w:tc>
+          <w:tcPr/>
+          <w:p>
+            <w:pPr>
+              <w:pStyle w:val="Compact"/>
+              <w:jc w:val="left"/>
+            </w:pPr>
+            <w:r>
+              <w:t xml:space="preserve">Jack Makhlouf</w:t>
+            </w:r>
+          </w:p>
+        </w:tc>
+        <w:tc>
+          <w:tcPr/>
+          <w:p>
+            <w:pPr>
+              <w:pStyle w:val="Compact"/>
+              <w:jc w:val="left"/>
+            </w:pPr>
+            <w:r>
+              <w:t xml:space="preserve">⚠️ no USD value</w:t>
+            </w:r>
+          </w:p>
+        </w:tc>
+        <w:tc>
+          <w:tcPr/>
+          <w:p>
+            <w:pPr>
+              <w:pStyle w:val="Compact"/>
+              <w:jc w:val="left"/>
+            </w:pPr>
+            <w:r>
+              <w:t xml:space="preserve">activity + record update</w:t>
+            </w:r>
+          </w:p>
+        </w:tc>
+        <w:tc>
+          <w:tcPr/>
+          <w:p>
+            <w:pPr>
+              <w:pStyle w:val="Compact"/>
+              <w:jc w:val="left"/>
+            </w:pPr>
+            <w:r>
+              <w:t xml:space="preserve">2026-09-01 (0d ago)</w:t>
+            </w:r>
+          </w:p>
+        </w:tc>
+      </w:tr>
+    </w:tbl>
+    <w:bookmarkEnd w:id="23"/>
+    <w:bookmarkStart w:id="24" w:name="initial-engagement-2-deals-0-usd"/>
+    <w:p>
+      <w:pPr>
+        <w:pStyle w:val="Heading3"/>
+      </w:pPr>
+      <w:r>
+        <w:t xml:space="preserve">Initial Engagement — 2 deal(s), 0 USD</w:t>
+      </w:r>
+    </w:p>
+    <w:tbl>
+      <w:tblPr>
+        <w:tblStyle w:val="Table"/>
+        <w:tblW w:type="pct" w:w="5000"/>
+        <w:tblLook w:firstRow="1" w:lastRow="0" w:firstColumn="0" w:lastColumn="0" w:noHBand="0" w:noVBand="0" w:val="0020"/>
+        <w:jc w:val="start"/>
+      </w:tblPr>
+      <w:tblGrid>
+        <w:gridCol w:w="896"/>
+        <w:gridCol w:w="1046"/>
+        <w:gridCol w:w="1643"/>
+        <w:gridCol w:w="2092"/>
+        <w:gridCol w:w="2241"/>
+      </w:tblGrid>
+      <w:tr>
+        <w:trPr>
+          <w:tblHeader w:val="true"/>
+        </w:trPr>
+        <w:tc>
+          <w:tcPr/>
+          <w:p>
+            <w:pPr>
+              <w:pStyle w:val="Compact"/>
+              <w:jc w:val="left"/>
+            </w:pPr>
+            <w:r>
+              <w:t xml:space="preserve">Deal</w:t>
+            </w:r>
+          </w:p>
+        </w:tc>
+        <w:tc>
+          <w:tcPr/>
+          <w:p>
+            <w:pPr>
+              <w:pStyle w:val="Compact"/>
+              <w:jc w:val="left"/>
+            </w:pPr>
+            <w:r>
+              <w:t xml:space="preserve">Owner</w:t>
+            </w:r>
+          </w:p>
+        </w:tc>
+        <w:tc>
+          <w:tcPr/>
+          <w:p>
+            <w:pPr>
+              <w:pStyle w:val="Compact"/>
+              <w:jc w:val="left"/>
+            </w:pPr>
+            <w:r>
+              <w:t xml:space="preserve">USD value</w:t>
+            </w:r>
+          </w:p>
+        </w:tc>
+        <w:tc>
+          <w:tcPr/>
+          <w:p>
+            <w:pPr>
+              <w:pStyle w:val="Compact"/>
+              <w:jc w:val="left"/>
+            </w:pPr>
+            <w:r>
+              <w:t xml:space="preserve">What changed</w:t>
+            </w:r>
+          </w:p>
+        </w:tc>
+        <w:tc>
+          <w:tcPr/>
+          <w:p>
+            <w:pPr>
+              <w:pStyle w:val="Compact"/>
+              <w:jc w:val="left"/>
+            </w:pPr>
+            <w:r>
+              <w:t xml:space="preserve">Last activity</w:t>
+            </w:r>
+          </w:p>
+        </w:tc>
+      </w:tr>
+      <w:tr>
+        <w:tc>
+          <w:tcPr/>
+          <w:p>
+            <w:pPr>
+              <w:pStyle w:val="Compact"/>
+              <w:jc w:val="left"/>
+            </w:pPr>
+            <w:r>
+              <w:t xml:space="preserve">(AC) Western University of Health Sciences (#59729752194)</w:t>
+            </w:r>
+          </w:p>
+        </w:tc>
+        <w:tc>
+          <w:tcPr/>
+          <w:p>
+            <w:pPr>
+              <w:pStyle w:val="Compact"/>
+              <w:jc w:val="left"/>
+            </w:pPr>
+            <w:r>
+              <w:t xml:space="preserve">Jack Makhlouf</w:t>
+            </w:r>
+          </w:p>
+        </w:tc>
+        <w:tc>
+          <w:tcPr/>
+          <w:p>
+            <w:pPr>
+              <w:pStyle w:val="Compact"/>
+              <w:jc w:val="left"/>
+            </w:pPr>
+            <w:r>
+              <w:t xml:space="preserve">0</w:t>
+            </w:r>
+          </w:p>
+        </w:tc>
+        <w:tc>
+          <w:tcPr/>
+          <w:p>
+            <w:pPr>
+              <w:pStyle w:val="Compact"/>
+              <w:jc w:val="left"/>
+            </w:pPr>
+            <w:r>
+              <w:t xml:space="preserve">activity + record update</w:t>
+            </w:r>
+          </w:p>
+        </w:tc>
+        <w:tc>
+          <w:tcPr/>
+          <w:p>
+            <w:pPr>
+              <w:pStyle w:val="Compact"/>
+              <w:jc w:val="left"/>
+            </w:pPr>
+            <w:r>
+              <w:t xml:space="preserve">2026-09-01 (0d ago)</w:t>
+            </w:r>
+          </w:p>
+        </w:tc>
+      </w:tr>
+      <w:tr>
+        <w:tc>
+          <w:tcPr/>
+          <w:p>
+            <w:pPr>
+              <w:pStyle w:val="Compact"/>
+              <w:jc w:val="left"/>
+            </w:pPr>
+            <w:r>
+              <w:t xml:space="preserve">(AC) Noorda College of Osteopathic Medicine (#59729814536)</w:t>
+            </w:r>
+          </w:p>
+        </w:tc>
+        <w:tc>
+          <w:tcPr/>
+          <w:p>
+            <w:pPr>
+              <w:pStyle w:val="Compact"/>
+              <w:jc w:val="left"/>
+            </w:pPr>
+            <w:r>
+              <w:t xml:space="preserve">Jack Makhlouf</w:t>
+            </w:r>
+          </w:p>
+        </w:tc>
+        <w:tc>
+          <w:tcPr/>
+          <w:p>
+            <w:pPr>
+              <w:pStyle w:val="Compact"/>
+              <w:jc w:val="left"/>
+            </w:pPr>
+            <w:r>
+              <w:t xml:space="preserve">0</w:t>
+            </w:r>
+          </w:p>
+        </w:tc>
+        <w:tc>
+          <w:tcPr/>
+          <w:p>
+            <w:pPr>
+              <w:pStyle w:val="Compact"/>
+              <w:jc w:val="left"/>
+            </w:pPr>
+            <w:r>
+              <w:t xml:space="preserve">activity + record update</w:t>
+            </w:r>
+          </w:p>
+        </w:tc>
+        <w:tc>
+          <w:tcPr/>
+          <w:p>
+            <w:pPr>
+              <w:pStyle w:val="Compact"/>
+              <w:jc w:val="left"/>
+            </w:pPr>
+            <w:r>
+              <w:t xml:space="preserve">2026-09-01 (0d ago)</w:t>
+            </w:r>
+          </w:p>
+        </w:tc>
+      </w:tr>
+    </w:tbl>
+    <w:bookmarkEnd w:id="24"/>
+    <w:bookmarkEnd w:id="25"/>
+    <w:bookmarkStart w:id="30" w:name="alerts"/>
     <w:p>
       <w:pPr>
         <w:pStyle w:val="Heading2"/>
@@ -248,7 +1782,7 @@
         <w:t xml:space="preserve">SQL (132) &gt; MQL (36)</w:t>
       </w:r>
     </w:p>
-    <w:bookmarkStart w:id="20" w:name="X89fd47b49059f192663280f16576806270af3ce"/>
+    <w:bookmarkStart w:id="26" w:name="X89fd47b49059f192663280f16576806270af3ce"/>
     <w:p>
       <w:pPr>
         <w:pStyle w:val="Heading3"/>
@@ -603,8 +2137,8 @@
         </w:tc>
       </w:tr>
     </w:tbl>
-    <w:bookmarkEnd w:id="20"/>
-    <w:bookmarkStart w:id="21" w:name="miscategorised-leads-21-20"/>
+    <w:bookmarkEnd w:id="26"/>
+    <w:bookmarkStart w:id="27" w:name="miscategorised-leads-21-20"/>
     <w:p>
       <w:pPr>
         <w:pStyle w:val="Heading3"/>
@@ -1738,8 +3272,8 @@
         </w:tc>
       </w:tr>
     </w:tbl>
-    <w:bookmarkEnd w:id="21"/>
-    <w:bookmarkStart w:id="22" w:name="deals-with-no-usd-home-currency-value"/>
+    <w:bookmarkEnd w:id="27"/>
+    <w:bookmarkStart w:id="28" w:name="deals-with-no-usd-home-currency-value"/>
     <w:p>
       <w:pPr>
         <w:pStyle w:val="Heading3"/>
@@ -2012,8 +3546,8 @@
         </w:tc>
       </w:tr>
     </w:tbl>
-    <w:bookmarkEnd w:id="22"/>
-    <w:bookmarkStart w:id="23" w:name="funnel-inversion-sql-132-mql-36"/>
+    <w:bookmarkEnd w:id="28"/>
+    <w:bookmarkStart w:id="29" w:name="funnel-inversion-sql-132-mql-36"/>
     <w:p>
       <w:pPr>
         <w:pStyle w:val="Heading3"/>
@@ -2030,9 +3564,9 @@
         <w:t xml:space="preserve">More Sales Qualified than Marketing Qualified Leads. Expected the funnel to narrow (MQL ≥ SQL). Likely causes: leads skipping the MQL stage, MQL criteria too strict, or bulk SQL promotion. Worth a look.</w:t>
       </w:r>
     </w:p>
-    <w:bookmarkEnd w:id="23"/>
-    <w:bookmarkEnd w:id="24"/>
-    <w:bookmarkStart w:id="25" w:name="funnel-b2b-contacts-per-lifecycle-stage"/>
+    <w:bookmarkEnd w:id="29"/>
+    <w:bookmarkEnd w:id="30"/>
+    <w:bookmarkStart w:id="31" w:name="funnel-b2b-contacts-per-lifecycle-stage"/>
     <w:p>
       <w:pPr>
         <w:pStyle w:val="Heading2"/>
@@ -2298,8 +3832,8 @@
         </w:tc>
       </w:tr>
     </w:tbl>
-    <w:bookmarkEnd w:id="25"/>
-    <w:bookmarkStart w:id="26" w:name="mql-vs-sql"/>
+    <w:bookmarkEnd w:id="31"/>
+    <w:bookmarkStart w:id="32" w:name="mql-vs-sql"/>
     <w:p>
       <w:pPr>
         <w:pStyle w:val="Heading2"/>
@@ -2396,8 +3930,8 @@
         <w:t xml:space="preserve">⚠️ YES</w:t>
       </w:r>
     </w:p>
-    <w:bookmarkEnd w:id="26"/>
-    <w:bookmarkStart w:id="27" w:name="deals-count-and-value-by-stage-usd"/>
+    <w:bookmarkEnd w:id="32"/>
+    <w:bookmarkStart w:id="33" w:name="deals-count-and-value-by-stage-usd"/>
     <w:p>
       <w:pPr>
         <w:pStyle w:val="Heading2"/>
@@ -2842,1271 +4376,6 @@
         <w:t xml:space="preserve">Value per stage note: pre-deal lifecycle stages (Email Contact, Lead, MQL) are contact counts only and carry no deal value — deal value exists only from the deal pipeline stages above.</w:t>
       </w:r>
     </w:p>
-    <w:bookmarkEnd w:id="27"/>
-    <w:bookmarkStart w:id="33" w:name="what-moved-this-week-7-day-view"/>
-    <w:p>
-      <w:pPr>
-        <w:pStyle w:val="Heading2"/>
-      </w:pPr>
-      <w:r>
-        <w:t xml:space="preserve">📈 What moved this week (7-day view)</w:t>
-      </w:r>
-    </w:p>
-    <w:p>
-      <w:pPr>
-        <w:pStyle w:val="FirstParagraph"/>
-      </w:pPr>
-      <w:r>
-        <w:t xml:space="preserve">Deals with a stage change, logged activity, or field update in the last 7 days. Grouped by current stage, highest USD value first. Stage-change vs field-update cannot always be separated without deal history, so the change column is best-effort.</w:t>
-      </w:r>
-    </w:p>
-    <w:p>
-      <w:pPr>
-        <w:pStyle w:val="BodyText"/>
-      </w:pPr>
-      <w:r>
-        <w:rPr>
-          <w:bCs/>
-          <w:b/>
-        </w:rPr>
-        <w:t xml:space="preserve">17 deal(s) active this week.</w:t>
-      </w:r>
-    </w:p>
-    <w:bookmarkStart w:id="28" w:name="qualified-to-buy-7-deals-120100-usd"/>
-    <w:p>
-      <w:pPr>
-        <w:pStyle w:val="Heading3"/>
-      </w:pPr>
-      <w:r>
-        <w:t xml:space="preserve">Qualified to Buy — 7 deal(s), 120,100 USD</w:t>
-      </w:r>
-    </w:p>
-    <w:tbl>
-      <w:tblPr>
-        <w:tblStyle w:val="Table"/>
-        <w:tblW w:type="pct" w:w="5000"/>
-        <w:tblLook w:firstRow="1" w:lastRow="0" w:firstColumn="0" w:lastColumn="0" w:noHBand="0" w:noVBand="0" w:val="0020"/>
-        <w:jc w:val="start"/>
-      </w:tblPr>
-      <w:tblGrid>
-        <w:gridCol w:w="1033"/>
-        <w:gridCol w:w="1893"/>
-        <w:gridCol w:w="2410"/>
-        <w:gridCol w:w="2582"/>
-      </w:tblGrid>
-      <w:tr>
-        <w:trPr>
-          <w:tblHeader w:val="true"/>
-        </w:trPr>
-        <w:tc>
-          <w:tcPr/>
-          <w:p>
-            <w:pPr>
-              <w:pStyle w:val="Compact"/>
-              <w:jc w:val="left"/>
-            </w:pPr>
-            <w:r>
-              <w:t xml:space="preserve">Deal</w:t>
-            </w:r>
-          </w:p>
-        </w:tc>
-        <w:tc>
-          <w:tcPr/>
-          <w:p>
-            <w:pPr>
-              <w:pStyle w:val="Compact"/>
-              <w:jc w:val="left"/>
-            </w:pPr>
-            <w:r>
-              <w:t xml:space="preserve">USD value</w:t>
-            </w:r>
-          </w:p>
-        </w:tc>
-        <w:tc>
-          <w:tcPr/>
-          <w:p>
-            <w:pPr>
-              <w:pStyle w:val="Compact"/>
-              <w:jc w:val="left"/>
-            </w:pPr>
-            <w:r>
-              <w:t xml:space="preserve">What changed</w:t>
-            </w:r>
-          </w:p>
-        </w:tc>
-        <w:tc>
-          <w:tcPr/>
-          <w:p>
-            <w:pPr>
-              <w:pStyle w:val="Compact"/>
-              <w:jc w:val="left"/>
-            </w:pPr>
-            <w:r>
-              <w:t xml:space="preserve">Last activity</w:t>
-            </w:r>
-          </w:p>
-        </w:tc>
-      </w:tr>
-      <w:tr>
-        <w:tc>
-          <w:tcPr/>
-          <w:p>
-            <w:pPr>
-              <w:pStyle w:val="Compact"/>
-              <w:jc w:val="left"/>
-            </w:pPr>
-            <w:r>
-              <w:t xml:space="preserve">Mopec - Custom VR Product SIM (#60019887668)</w:t>
-            </w:r>
-          </w:p>
-        </w:tc>
-        <w:tc>
-          <w:tcPr/>
-          <w:p>
-            <w:pPr>
-              <w:pStyle w:val="Compact"/>
-              <w:jc w:val="left"/>
-            </w:pPr>
-            <w:r>
-              <w:t xml:space="preserve">90,000</w:t>
-            </w:r>
-          </w:p>
-        </w:tc>
-        <w:tc>
-          <w:tcPr/>
-          <w:p>
-            <w:pPr>
-              <w:pStyle w:val="Compact"/>
-              <w:jc w:val="left"/>
-            </w:pPr>
-            <w:r>
-              <w:t xml:space="preserve">activity + record update</w:t>
-            </w:r>
-          </w:p>
-        </w:tc>
-        <w:tc>
-          <w:tcPr/>
-          <w:p>
-            <w:pPr>
-              <w:pStyle w:val="Compact"/>
-              <w:jc w:val="left"/>
-            </w:pPr>
-            <w:r>
-              <w:t xml:space="preserve">2026-08-27 (4d ago)</w:t>
-            </w:r>
-          </w:p>
-        </w:tc>
-      </w:tr>
-      <w:tr>
-        <w:tc>
-          <w:tcPr/>
-          <w:p>
-            <w:pPr>
-              <w:pStyle w:val="Compact"/>
-              <w:jc w:val="left"/>
-            </w:pPr>
-            <w:r>
-              <w:t xml:space="preserve">Wellstar Hospital Network (#63701350283)</w:t>
-            </w:r>
-          </w:p>
-        </w:tc>
-        <w:tc>
-          <w:tcPr/>
-          <w:p>
-            <w:pPr>
-              <w:pStyle w:val="Compact"/>
-              <w:jc w:val="left"/>
-            </w:pPr>
-            <w:r>
-              <w:t xml:space="preserve">25,000</w:t>
-            </w:r>
-          </w:p>
-        </w:tc>
-        <w:tc>
-          <w:tcPr/>
-          <w:p>
-            <w:pPr>
-              <w:pStyle w:val="Compact"/>
-              <w:jc w:val="left"/>
-            </w:pPr>
-            <w:r>
-              <w:t xml:space="preserve">activity + record update</w:t>
-            </w:r>
-          </w:p>
-        </w:tc>
-        <w:tc>
-          <w:tcPr/>
-          <w:p>
-            <w:pPr>
-              <w:pStyle w:val="Compact"/>
-              <w:jc w:val="left"/>
-            </w:pPr>
-            <w:r>
-              <w:t xml:space="preserve">2026-09-01 (0d ago)</w:t>
-            </w:r>
-          </w:p>
-        </w:tc>
-      </w:tr>
-      <w:tr>
-        <w:tc>
-          <w:tcPr/>
-          <w:p>
-            <w:pPr>
-              <w:pStyle w:val="Compact"/>
-              <w:jc w:val="left"/>
-            </w:pPr>
-            <w:r>
-              <w:t xml:space="preserve">(AC) Nnamdi Azikiwe University / New Deal (#59610029666)</w:t>
-            </w:r>
-          </w:p>
-        </w:tc>
-        <w:tc>
-          <w:tcPr/>
-          <w:p>
-            <w:pPr>
-              <w:pStyle w:val="Compact"/>
-              <w:jc w:val="left"/>
-            </w:pPr>
-            <w:r>
-              <w:t xml:space="preserve">5,100</w:t>
-            </w:r>
-          </w:p>
-        </w:tc>
-        <w:tc>
-          <w:tcPr/>
-          <w:p>
-            <w:pPr>
-              <w:pStyle w:val="Compact"/>
-              <w:jc w:val="left"/>
-            </w:pPr>
-            <w:r>
-              <w:t xml:space="preserve">field/stage update (no new activity)</w:t>
-            </w:r>
-          </w:p>
-        </w:tc>
-        <w:tc>
-          <w:tcPr/>
-          <w:p>
-            <w:pPr>
-              <w:pStyle w:val="Compact"/>
-              <w:jc w:val="left"/>
-            </w:pPr>
-            <w:r>
-              <w:t xml:space="preserve">2026-06-24 (68d ago)</w:t>
-            </w:r>
-          </w:p>
-        </w:tc>
-      </w:tr>
-      <w:tr>
-        <w:tc>
-          <w:tcPr/>
-          <w:p>
-            <w:pPr>
-              <w:pStyle w:val="Compact"/>
-              <w:jc w:val="left"/>
-            </w:pPr>
-            <w:r>
-              <w:t xml:space="preserve">(Pilot HAPS) -University of Mississippi - Ole Miss (#60786237714)</w:t>
-            </w:r>
-          </w:p>
-        </w:tc>
-        <w:tc>
-          <w:tcPr/>
-          <w:p>
-            <w:pPr>
-              <w:pStyle w:val="Compact"/>
-              <w:jc w:val="left"/>
-            </w:pPr>
-            <w:r>
-              <w:t xml:space="preserve">0</w:t>
-            </w:r>
-          </w:p>
-        </w:tc>
-        <w:tc>
-          <w:tcPr/>
-          <w:p>
-            <w:pPr>
-              <w:pStyle w:val="Compact"/>
-              <w:jc w:val="left"/>
-            </w:pPr>
-            <w:r>
-              <w:t xml:space="preserve">activity + record update</w:t>
-            </w:r>
-          </w:p>
-        </w:tc>
-        <w:tc>
-          <w:tcPr/>
-          <w:p>
-            <w:pPr>
-              <w:pStyle w:val="Compact"/>
-              <w:jc w:val="left"/>
-            </w:pPr>
-            <w:r>
-              <w:t xml:space="preserve">2026-09-01 (0d ago)</w:t>
-            </w:r>
-          </w:p>
-        </w:tc>
-      </w:tr>
-      <w:tr>
-        <w:tc>
-          <w:tcPr/>
-          <w:p>
-            <w:pPr>
-              <w:pStyle w:val="Compact"/>
-              <w:jc w:val="left"/>
-            </w:pPr>
-            <w:r>
-              <w:t xml:space="preserve">(Pilot HAPS) - University of Detroit Mercy (#60785744196)</w:t>
-            </w:r>
-          </w:p>
-        </w:tc>
-        <w:tc>
-          <w:tcPr/>
-          <w:p>
-            <w:pPr>
-              <w:pStyle w:val="Compact"/>
-              <w:jc w:val="left"/>
-            </w:pPr>
-            <w:r>
-              <w:t xml:space="preserve">0</w:t>
-            </w:r>
-          </w:p>
-        </w:tc>
-        <w:tc>
-          <w:tcPr/>
-          <w:p>
-            <w:pPr>
-              <w:pStyle w:val="Compact"/>
-              <w:jc w:val="left"/>
-            </w:pPr>
-            <w:r>
-              <w:t xml:space="preserve">activity + record update</w:t>
-            </w:r>
-          </w:p>
-        </w:tc>
-        <w:tc>
-          <w:tcPr/>
-          <w:p>
-            <w:pPr>
-              <w:pStyle w:val="Compact"/>
-              <w:jc w:val="left"/>
-            </w:pPr>
-            <w:r>
-              <w:t xml:space="preserve">2026-09-01 (0d ago)</w:t>
-            </w:r>
-          </w:p>
-        </w:tc>
-      </w:tr>
-      <w:tr>
-        <w:tc>
-          <w:tcPr/>
-          <w:p>
-            <w:pPr>
-              <w:pStyle w:val="Compact"/>
-              <w:jc w:val="left"/>
-            </w:pPr>
-            <w:r>
-              <w:t xml:space="preserve">(Pilot HAPS) Bluegrass Community &amp; Technical College (#60644345390)</w:t>
-            </w:r>
-          </w:p>
-        </w:tc>
-        <w:tc>
-          <w:tcPr/>
-          <w:p>
-            <w:pPr>
-              <w:pStyle w:val="Compact"/>
-              <w:jc w:val="left"/>
-            </w:pPr>
-            <w:r>
-              <w:t xml:space="preserve">0</w:t>
-            </w:r>
-          </w:p>
-        </w:tc>
-        <w:tc>
-          <w:tcPr/>
-          <w:p>
-            <w:pPr>
-              <w:pStyle w:val="Compact"/>
-              <w:jc w:val="left"/>
-            </w:pPr>
-            <w:r>
-              <w:t xml:space="preserve">activity + record update</w:t>
-            </w:r>
-          </w:p>
-        </w:tc>
-        <w:tc>
-          <w:tcPr/>
-          <w:p>
-            <w:pPr>
-              <w:pStyle w:val="Compact"/>
-              <w:jc w:val="left"/>
-            </w:pPr>
-            <w:r>
-              <w:t xml:space="preserve">2026-09-01 (0d ago)</w:t>
-            </w:r>
-          </w:p>
-        </w:tc>
-      </w:tr>
-      <w:tr>
-        <w:tc>
-          <w:tcPr/>
-          <w:p>
-            <w:pPr>
-              <w:pStyle w:val="Compact"/>
-              <w:jc w:val="left"/>
-            </w:pPr>
-            <w:r>
-              <w:t xml:space="preserve">(Pilot HAPS) UTSA - The University of Texas at San Antonio (#60182264878)</w:t>
-            </w:r>
-          </w:p>
-        </w:tc>
-        <w:tc>
-          <w:tcPr/>
-          <w:p>
-            <w:pPr>
-              <w:pStyle w:val="Compact"/>
-              <w:jc w:val="left"/>
-            </w:pPr>
-            <w:r>
-              <w:t xml:space="preserve">0</w:t>
-            </w:r>
-          </w:p>
-        </w:tc>
-        <w:tc>
-          <w:tcPr/>
-          <w:p>
-            <w:pPr>
-              <w:pStyle w:val="Compact"/>
-              <w:jc w:val="left"/>
-            </w:pPr>
-            <w:r>
-              <w:t xml:space="preserve">activity + record update</w:t>
-            </w:r>
-          </w:p>
-        </w:tc>
-        <w:tc>
-          <w:tcPr/>
-          <w:p>
-            <w:pPr>
-              <w:pStyle w:val="Compact"/>
-              <w:jc w:val="left"/>
-            </w:pPr>
-            <w:r>
-              <w:t xml:space="preserve">2026-09-01 (0d ago)</w:t>
-            </w:r>
-          </w:p>
-        </w:tc>
-      </w:tr>
-    </w:tbl>
-    <w:bookmarkEnd w:id="28"/>
-    <w:bookmarkStart w:id="29" w:name="closed-won-1-deals-18000-usd"/>
-    <w:p>
-      <w:pPr>
-        <w:pStyle w:val="Heading3"/>
-      </w:pPr>
-      <w:r>
-        <w:t xml:space="preserve">Closed Won — 1 deal(s), 18,000 USD</w:t>
-      </w:r>
-    </w:p>
-    <w:tbl>
-      <w:tblPr>
-        <w:tblStyle w:val="Table"/>
-        <w:tblW w:type="pct" w:w="5000"/>
-        <w:tblLook w:firstRow="1" w:lastRow="0" w:firstColumn="0" w:lastColumn="0" w:noHBand="0" w:noVBand="0" w:val="0020"/>
-        <w:jc w:val="start"/>
-      </w:tblPr>
-      <w:tblGrid>
-        <w:gridCol w:w="1033"/>
-        <w:gridCol w:w="1893"/>
-        <w:gridCol w:w="2410"/>
-        <w:gridCol w:w="2582"/>
-      </w:tblGrid>
-      <w:tr>
-        <w:trPr>
-          <w:tblHeader w:val="true"/>
-        </w:trPr>
-        <w:tc>
-          <w:tcPr/>
-          <w:p>
-            <w:pPr>
-              <w:pStyle w:val="Compact"/>
-              <w:jc w:val="left"/>
-            </w:pPr>
-            <w:r>
-              <w:t xml:space="preserve">Deal</w:t>
-            </w:r>
-          </w:p>
-        </w:tc>
-        <w:tc>
-          <w:tcPr/>
-          <w:p>
-            <w:pPr>
-              <w:pStyle w:val="Compact"/>
-              <w:jc w:val="left"/>
-            </w:pPr>
-            <w:r>
-              <w:t xml:space="preserve">USD value</w:t>
-            </w:r>
-          </w:p>
-        </w:tc>
-        <w:tc>
-          <w:tcPr/>
-          <w:p>
-            <w:pPr>
-              <w:pStyle w:val="Compact"/>
-              <w:jc w:val="left"/>
-            </w:pPr>
-            <w:r>
-              <w:t xml:space="preserve">What changed</w:t>
-            </w:r>
-          </w:p>
-        </w:tc>
-        <w:tc>
-          <w:tcPr/>
-          <w:p>
-            <w:pPr>
-              <w:pStyle w:val="Compact"/>
-              <w:jc w:val="left"/>
-            </w:pPr>
-            <w:r>
-              <w:t xml:space="preserve">Last activity</w:t>
-            </w:r>
-          </w:p>
-        </w:tc>
-      </w:tr>
-      <w:tr>
-        <w:tc>
-          <w:tcPr/>
-          <w:p>
-            <w:pPr>
-              <w:pStyle w:val="Compact"/>
-              <w:jc w:val="left"/>
-            </w:pPr>
-            <w:r>
-              <w:t xml:space="preserve">Dean College - New Deal / Anatomy 360 &amp; Digital Cadaver / 36 month subscription (#56896693933)</w:t>
-            </w:r>
-          </w:p>
-        </w:tc>
-        <w:tc>
-          <w:tcPr/>
-          <w:p>
-            <w:pPr>
-              <w:pStyle w:val="Compact"/>
-              <w:jc w:val="left"/>
-            </w:pPr>
-            <w:r>
-              <w:t xml:space="preserve">18,000</w:t>
-            </w:r>
-          </w:p>
-        </w:tc>
-        <w:tc>
-          <w:tcPr/>
-          <w:p>
-            <w:pPr>
-              <w:pStyle w:val="Compact"/>
-              <w:jc w:val="left"/>
-            </w:pPr>
-            <w:r>
-              <w:t xml:space="preserve">field/stage update (no new activity)</w:t>
-            </w:r>
-          </w:p>
-        </w:tc>
-        <w:tc>
-          <w:tcPr/>
-          <w:p>
-            <w:pPr>
-              <w:pStyle w:val="Compact"/>
-              <w:jc w:val="left"/>
-            </w:pPr>
-            <w:r>
-              <w:t xml:space="preserve">2026-07-07 (55d ago)</w:t>
-            </w:r>
-          </w:p>
-        </w:tc>
-      </w:tr>
-    </w:tbl>
-    <w:bookmarkEnd w:id="29"/>
-    <w:bookmarkStart w:id="30" w:name="quote-sent-1-deals-9000-usd"/>
-    <w:p>
-      <w:pPr>
-        <w:pStyle w:val="Heading3"/>
-      </w:pPr>
-      <w:r>
-        <w:t xml:space="preserve">Quote Sent — 1 deal(s), 9,000 USD</w:t>
-      </w:r>
-    </w:p>
-    <w:tbl>
-      <w:tblPr>
-        <w:tblStyle w:val="Table"/>
-        <w:tblW w:type="pct" w:w="5000"/>
-        <w:tblLook w:firstRow="1" w:lastRow="0" w:firstColumn="0" w:lastColumn="0" w:noHBand="0" w:noVBand="0" w:val="0020"/>
-        <w:jc w:val="start"/>
-      </w:tblPr>
-      <w:tblGrid>
-        <w:gridCol w:w="1033"/>
-        <w:gridCol w:w="1893"/>
-        <w:gridCol w:w="2410"/>
-        <w:gridCol w:w="2582"/>
-      </w:tblGrid>
-      <w:tr>
-        <w:trPr>
-          <w:tblHeader w:val="true"/>
-        </w:trPr>
-        <w:tc>
-          <w:tcPr/>
-          <w:p>
-            <w:pPr>
-              <w:pStyle w:val="Compact"/>
-              <w:jc w:val="left"/>
-            </w:pPr>
-            <w:r>
-              <w:t xml:space="preserve">Deal</w:t>
-            </w:r>
-          </w:p>
-        </w:tc>
-        <w:tc>
-          <w:tcPr/>
-          <w:p>
-            <w:pPr>
-              <w:pStyle w:val="Compact"/>
-              <w:jc w:val="left"/>
-            </w:pPr>
-            <w:r>
-              <w:t xml:space="preserve">USD value</w:t>
-            </w:r>
-          </w:p>
-        </w:tc>
-        <w:tc>
-          <w:tcPr/>
-          <w:p>
-            <w:pPr>
-              <w:pStyle w:val="Compact"/>
-              <w:jc w:val="left"/>
-            </w:pPr>
-            <w:r>
-              <w:t xml:space="preserve">What changed</w:t>
-            </w:r>
-          </w:p>
-        </w:tc>
-        <w:tc>
-          <w:tcPr/>
-          <w:p>
-            <w:pPr>
-              <w:pStyle w:val="Compact"/>
-              <w:jc w:val="left"/>
-            </w:pPr>
-            <w:r>
-              <w:t xml:space="preserve">Last activity</w:t>
-            </w:r>
-          </w:p>
-        </w:tc>
-      </w:tr>
-      <w:tr>
-        <w:tc>
-          <w:tcPr/>
-          <w:p>
-            <w:pPr>
-              <w:pStyle w:val="Compact"/>
-              <w:jc w:val="left"/>
-            </w:pPr>
-            <w:r>
-              <w:t xml:space="preserve">(License) Klamath Community College (#59644501846)</w:t>
-            </w:r>
-          </w:p>
-        </w:tc>
-        <w:tc>
-          <w:tcPr/>
-          <w:p>
-            <w:pPr>
-              <w:pStyle w:val="Compact"/>
-              <w:jc w:val="left"/>
-            </w:pPr>
-            <w:r>
-              <w:t xml:space="preserve">9,000</w:t>
-            </w:r>
-          </w:p>
-        </w:tc>
-        <w:tc>
-          <w:tcPr/>
-          <w:p>
-            <w:pPr>
-              <w:pStyle w:val="Compact"/>
-              <w:jc w:val="left"/>
-            </w:pPr>
-            <w:r>
-              <w:t xml:space="preserve">activity + record update</w:t>
-            </w:r>
-          </w:p>
-        </w:tc>
-        <w:tc>
-          <w:tcPr/>
-          <w:p>
-            <w:pPr>
-              <w:pStyle w:val="Compact"/>
-              <w:jc w:val="left"/>
-            </w:pPr>
-            <w:r>
-              <w:t xml:space="preserve">2026-09-01 (0d ago)</w:t>
-            </w:r>
-          </w:p>
-        </w:tc>
-      </w:tr>
-    </w:tbl>
-    <w:bookmarkEnd w:id="30"/>
-    <w:bookmarkStart w:id="31" w:name="discovery-trial-6-deals-9000-usd"/>
-    <w:p>
-      <w:pPr>
-        <w:pStyle w:val="Heading3"/>
-      </w:pPr>
-      <w:r>
-        <w:t xml:space="preserve">Discovery &amp; Trial — 6 deal(s), 9,000 USD</w:t>
-      </w:r>
-    </w:p>
-    <w:tbl>
-      <w:tblPr>
-        <w:tblStyle w:val="Table"/>
-        <w:tblW w:type="pct" w:w="5000"/>
-        <w:tblLook w:firstRow="1" w:lastRow="0" w:firstColumn="0" w:lastColumn="0" w:noHBand="0" w:noVBand="0" w:val="0020"/>
-        <w:jc w:val="start"/>
-      </w:tblPr>
-      <w:tblGrid>
-        <w:gridCol w:w="1033"/>
-        <w:gridCol w:w="1893"/>
-        <w:gridCol w:w="2410"/>
-        <w:gridCol w:w="2582"/>
-      </w:tblGrid>
-      <w:tr>
-        <w:trPr>
-          <w:tblHeader w:val="true"/>
-        </w:trPr>
-        <w:tc>
-          <w:tcPr/>
-          <w:p>
-            <w:pPr>
-              <w:pStyle w:val="Compact"/>
-              <w:jc w:val="left"/>
-            </w:pPr>
-            <w:r>
-              <w:t xml:space="preserve">Deal</w:t>
-            </w:r>
-          </w:p>
-        </w:tc>
-        <w:tc>
-          <w:tcPr/>
-          <w:p>
-            <w:pPr>
-              <w:pStyle w:val="Compact"/>
-              <w:jc w:val="left"/>
-            </w:pPr>
-            <w:r>
-              <w:t xml:space="preserve">USD value</w:t>
-            </w:r>
-          </w:p>
-        </w:tc>
-        <w:tc>
-          <w:tcPr/>
-          <w:p>
-            <w:pPr>
-              <w:pStyle w:val="Compact"/>
-              <w:jc w:val="left"/>
-            </w:pPr>
-            <w:r>
-              <w:t xml:space="preserve">What changed</w:t>
-            </w:r>
-          </w:p>
-        </w:tc>
-        <w:tc>
-          <w:tcPr/>
-          <w:p>
-            <w:pPr>
-              <w:pStyle w:val="Compact"/>
-              <w:jc w:val="left"/>
-            </w:pPr>
-            <w:r>
-              <w:t xml:space="preserve">Last activity</w:t>
-            </w:r>
-          </w:p>
-        </w:tc>
-      </w:tr>
-      <w:tr>
-        <w:tc>
-          <w:tcPr/>
-          <w:p>
-            <w:pPr>
-              <w:pStyle w:val="Compact"/>
-              <w:jc w:val="left"/>
-            </w:pPr>
-            <w:r>
-              <w:t xml:space="preserve">(License) UC San Diego Medical (#59680085122)</w:t>
-            </w:r>
-          </w:p>
-        </w:tc>
-        <w:tc>
-          <w:tcPr/>
-          <w:p>
-            <w:pPr>
-              <w:pStyle w:val="Compact"/>
-              <w:jc w:val="left"/>
-            </w:pPr>
-            <w:r>
-              <w:t xml:space="preserve">9,000</w:t>
-            </w:r>
-          </w:p>
-        </w:tc>
-        <w:tc>
-          <w:tcPr/>
-          <w:p>
-            <w:pPr>
-              <w:pStyle w:val="Compact"/>
-              <w:jc w:val="left"/>
-            </w:pPr>
-            <w:r>
-              <w:t xml:space="preserve">activity + record update</w:t>
-            </w:r>
-          </w:p>
-        </w:tc>
-        <w:tc>
-          <w:tcPr/>
-          <w:p>
-            <w:pPr>
-              <w:pStyle w:val="Compact"/>
-              <w:jc w:val="left"/>
-            </w:pPr>
-            <w:r>
-              <w:t xml:space="preserve">2026-08-26 (5d ago)</w:t>
-            </w:r>
-          </w:p>
-        </w:tc>
-      </w:tr>
-      <w:tr>
-        <w:tc>
-          <w:tcPr/>
-          <w:p>
-            <w:pPr>
-              <w:pStyle w:val="Compact"/>
-              <w:jc w:val="left"/>
-            </w:pPr>
-            <w:r>
-              <w:t xml:space="preserve">Royal National Orthopaedic Hospital / Dr.Boyne BELLEW- New Deal (#62115451054)</w:t>
-            </w:r>
-          </w:p>
-        </w:tc>
-        <w:tc>
-          <w:tcPr/>
-          <w:p>
-            <w:pPr>
-              <w:pStyle w:val="Compact"/>
-              <w:jc w:val="left"/>
-            </w:pPr>
-            <w:r>
-              <w:t xml:space="preserve">0</w:t>
-            </w:r>
-          </w:p>
-        </w:tc>
-        <w:tc>
-          <w:tcPr/>
-          <w:p>
-            <w:pPr>
-              <w:pStyle w:val="Compact"/>
-              <w:jc w:val="left"/>
-            </w:pPr>
-            <w:r>
-              <w:t xml:space="preserve">field/stage update (no new activity)</w:t>
-            </w:r>
-          </w:p>
-        </w:tc>
-        <w:tc>
-          <w:tcPr/>
-          <w:p>
-            <w:pPr>
-              <w:pStyle w:val="Compact"/>
-              <w:jc w:val="left"/>
-            </w:pPr>
-            <w:r>
-              <w:t xml:space="preserve">2026-07-16 (46d ago)</w:t>
-            </w:r>
-          </w:p>
-        </w:tc>
-      </w:tr>
-      <w:tr>
-        <w:tc>
-          <w:tcPr/>
-          <w:p>
-            <w:pPr>
-              <w:pStyle w:val="Compact"/>
-              <w:jc w:val="left"/>
-            </w:pPr>
-            <w:r>
-              <w:t xml:space="preserve">Uniformed Services University of the Health Sciences (USU) - New Deal (#61390460829)</w:t>
-            </w:r>
-          </w:p>
-        </w:tc>
-        <w:tc>
-          <w:tcPr/>
-          <w:p>
-            <w:pPr>
-              <w:pStyle w:val="Compact"/>
-              <w:jc w:val="left"/>
-            </w:pPr>
-            <w:r>
-              <w:t xml:space="preserve">0</w:t>
-            </w:r>
-          </w:p>
-        </w:tc>
-        <w:tc>
-          <w:tcPr/>
-          <w:p>
-            <w:pPr>
-              <w:pStyle w:val="Compact"/>
-              <w:jc w:val="left"/>
-            </w:pPr>
-            <w:r>
-              <w:t xml:space="preserve">activity + record update</w:t>
-            </w:r>
-          </w:p>
-        </w:tc>
-        <w:tc>
-          <w:tcPr/>
-          <w:p>
-            <w:pPr>
-              <w:pStyle w:val="Compact"/>
-              <w:jc w:val="left"/>
-            </w:pPr>
-            <w:r>
-              <w:t xml:space="preserve">2026-08-27 (4d ago)</w:t>
-            </w:r>
-          </w:p>
-        </w:tc>
-      </w:tr>
-      <w:tr>
-        <w:tc>
-          <w:tcPr/>
-          <w:p>
-            <w:pPr>
-              <w:pStyle w:val="Compact"/>
-              <w:jc w:val="left"/>
-            </w:pPr>
-            <w:r>
-              <w:t xml:space="preserve">(Pilot HAPS) Vincennes University (#60650552119)</w:t>
-            </w:r>
-          </w:p>
-        </w:tc>
-        <w:tc>
-          <w:tcPr/>
-          <w:p>
-            <w:pPr>
-              <w:pStyle w:val="Compact"/>
-              <w:jc w:val="left"/>
-            </w:pPr>
-            <w:r>
-              <w:t xml:space="preserve">0</w:t>
-            </w:r>
-          </w:p>
-        </w:tc>
-        <w:tc>
-          <w:tcPr/>
-          <w:p>
-            <w:pPr>
-              <w:pStyle w:val="Compact"/>
-              <w:jc w:val="left"/>
-            </w:pPr>
-            <w:r>
-              <w:t xml:space="preserve">activity + record update</w:t>
-            </w:r>
-          </w:p>
-        </w:tc>
-        <w:tc>
-          <w:tcPr/>
-          <w:p>
-            <w:pPr>
-              <w:pStyle w:val="Compact"/>
-              <w:jc w:val="left"/>
-            </w:pPr>
-            <w:r>
-              <w:t xml:space="preserve">2026-09-01 (0d ago)</w:t>
-            </w:r>
-          </w:p>
-        </w:tc>
-      </w:tr>
-      <w:tr>
-        <w:tc>
-          <w:tcPr/>
-          <w:p>
-            <w:pPr>
-              <w:pStyle w:val="Compact"/>
-              <w:jc w:val="left"/>
-            </w:pPr>
-            <w:r>
-              <w:t xml:space="preserve">(AC) University of Miami (#59729814549)</w:t>
-            </w:r>
-          </w:p>
-        </w:tc>
-        <w:tc>
-          <w:tcPr/>
-          <w:p>
-            <w:pPr>
-              <w:pStyle w:val="Compact"/>
-              <w:jc w:val="left"/>
-            </w:pPr>
-            <w:r>
-              <w:t xml:space="preserve">0</w:t>
-            </w:r>
-          </w:p>
-        </w:tc>
-        <w:tc>
-          <w:tcPr/>
-          <w:p>
-            <w:pPr>
-              <w:pStyle w:val="Compact"/>
-              <w:jc w:val="left"/>
-            </w:pPr>
-            <w:r>
-              <w:t xml:space="preserve">activity + record update</w:t>
-            </w:r>
-          </w:p>
-        </w:tc>
-        <w:tc>
-          <w:tcPr/>
-          <w:p>
-            <w:pPr>
-              <w:pStyle w:val="Compact"/>
-              <w:jc w:val="left"/>
-            </w:pPr>
-            <w:r>
-              <w:t xml:space="preserve">2026-09-01 (0d ago)</w:t>
-            </w:r>
-          </w:p>
-        </w:tc>
-      </w:tr>
-      <w:tr>
-        <w:tc>
-          <w:tcPr/>
-          <w:p>
-            <w:pPr>
-              <w:pStyle w:val="Compact"/>
-              <w:jc w:val="left"/>
-            </w:pPr>
-            <w:r>
-              <w:t xml:space="preserve">Univ Miami Bascom Eye Institute (#55031048968)</w:t>
-            </w:r>
-          </w:p>
-        </w:tc>
-        <w:tc>
-          <w:tcPr/>
-          <w:p>
-            <w:pPr>
-              <w:pStyle w:val="Compact"/>
-              <w:jc w:val="left"/>
-            </w:pPr>
-            <w:r>
-              <w:t xml:space="preserve">⚠️ no USD value</w:t>
-            </w:r>
-          </w:p>
-        </w:tc>
-        <w:tc>
-          <w:tcPr/>
-          <w:p>
-            <w:pPr>
-              <w:pStyle w:val="Compact"/>
-              <w:jc w:val="left"/>
-            </w:pPr>
-            <w:r>
-              <w:t xml:space="preserve">activity + record update</w:t>
-            </w:r>
-          </w:p>
-        </w:tc>
-        <w:tc>
-          <w:tcPr/>
-          <w:p>
-            <w:pPr>
-              <w:pStyle w:val="Compact"/>
-              <w:jc w:val="left"/>
-            </w:pPr>
-            <w:r>
-              <w:t xml:space="preserve">2026-09-01 (0d ago)</w:t>
-            </w:r>
-          </w:p>
-        </w:tc>
-      </w:tr>
-    </w:tbl>
-    <w:bookmarkEnd w:id="31"/>
-    <w:bookmarkStart w:id="32" w:name="initial-engagement-2-deals-0-usd"/>
-    <w:p>
-      <w:pPr>
-        <w:pStyle w:val="Heading3"/>
-      </w:pPr>
-      <w:r>
-        <w:t xml:space="preserve">Initial Engagement — 2 deal(s), 0 USD</w:t>
-      </w:r>
-    </w:p>
-    <w:tbl>
-      <w:tblPr>
-        <w:tblStyle w:val="Table"/>
-        <w:tblW w:type="pct" w:w="5000"/>
-        <w:tblLook w:firstRow="1" w:lastRow="0" w:firstColumn="0" w:lastColumn="0" w:noHBand="0" w:noVBand="0" w:val="0020"/>
-        <w:jc w:val="start"/>
-      </w:tblPr>
-      <w:tblGrid>
-        <w:gridCol w:w="1033"/>
-        <w:gridCol w:w="1893"/>
-        <w:gridCol w:w="2410"/>
-        <w:gridCol w:w="2582"/>
-      </w:tblGrid>
-      <w:tr>
-        <w:trPr>
-          <w:tblHeader w:val="true"/>
-        </w:trPr>
-        <w:tc>
-          <w:tcPr/>
-          <w:p>
-            <w:pPr>
-              <w:pStyle w:val="Compact"/>
-              <w:jc w:val="left"/>
-            </w:pPr>
-            <w:r>
-              <w:t xml:space="preserve">Deal</w:t>
-            </w:r>
-          </w:p>
-        </w:tc>
-        <w:tc>
-          <w:tcPr/>
-          <w:p>
-            <w:pPr>
-              <w:pStyle w:val="Compact"/>
-              <w:jc w:val="left"/>
-            </w:pPr>
-            <w:r>
-              <w:t xml:space="preserve">USD value</w:t>
-            </w:r>
-          </w:p>
-        </w:tc>
-        <w:tc>
-          <w:tcPr/>
-          <w:p>
-            <w:pPr>
-              <w:pStyle w:val="Compact"/>
-              <w:jc w:val="left"/>
-            </w:pPr>
-            <w:r>
-              <w:t xml:space="preserve">What changed</w:t>
-            </w:r>
-          </w:p>
-        </w:tc>
-        <w:tc>
-          <w:tcPr/>
-          <w:p>
-            <w:pPr>
-              <w:pStyle w:val="Compact"/>
-              <w:jc w:val="left"/>
-            </w:pPr>
-            <w:r>
-              <w:t xml:space="preserve">Last activity</w:t>
-            </w:r>
-          </w:p>
-        </w:tc>
-      </w:tr>
-      <w:tr>
-        <w:tc>
-          <w:tcPr/>
-          <w:p>
-            <w:pPr>
-              <w:pStyle w:val="Compact"/>
-              <w:jc w:val="left"/>
-            </w:pPr>
-            <w:r>
-              <w:t xml:space="preserve">(AC) Western University of Health Sciences (#59729752194)</w:t>
-            </w:r>
-          </w:p>
-        </w:tc>
-        <w:tc>
-          <w:tcPr/>
-          <w:p>
-            <w:pPr>
-              <w:pStyle w:val="Compact"/>
-              <w:jc w:val="left"/>
-            </w:pPr>
-            <w:r>
-              <w:t xml:space="preserve">0</w:t>
-            </w:r>
-          </w:p>
-        </w:tc>
-        <w:tc>
-          <w:tcPr/>
-          <w:p>
-            <w:pPr>
-              <w:pStyle w:val="Compact"/>
-              <w:jc w:val="left"/>
-            </w:pPr>
-            <w:r>
-              <w:t xml:space="preserve">activity + record update</w:t>
-            </w:r>
-          </w:p>
-        </w:tc>
-        <w:tc>
-          <w:tcPr/>
-          <w:p>
-            <w:pPr>
-              <w:pStyle w:val="Compact"/>
-              <w:jc w:val="left"/>
-            </w:pPr>
-            <w:r>
-              <w:t xml:space="preserve">2026-09-01 (0d ago)</w:t>
-            </w:r>
-          </w:p>
-        </w:tc>
-      </w:tr>
-      <w:tr>
-        <w:tc>
-          <w:tcPr/>
-          <w:p>
-            <w:pPr>
-              <w:pStyle w:val="Compact"/>
-              <w:jc w:val="left"/>
-            </w:pPr>
-            <w:r>
-              <w:t xml:space="preserve">(AC) Noorda College of Osteopathic Medicine (#59729814536)</w:t>
-            </w:r>
-          </w:p>
-        </w:tc>
-        <w:tc>
-          <w:tcPr/>
-          <w:p>
-            <w:pPr>
-              <w:pStyle w:val="Compact"/>
-              <w:jc w:val="left"/>
-            </w:pPr>
-            <w:r>
-              <w:t xml:space="preserve">0</w:t>
-            </w:r>
-          </w:p>
-        </w:tc>
-        <w:tc>
-          <w:tcPr/>
-          <w:p>
-            <w:pPr>
-              <w:pStyle w:val="Compact"/>
-              <w:jc w:val="left"/>
-            </w:pPr>
-            <w:r>
-              <w:t xml:space="preserve">activity + record update</w:t>
-            </w:r>
-          </w:p>
-        </w:tc>
-        <w:tc>
-          <w:tcPr/>
-          <w:p>
-            <w:pPr>
-              <w:pStyle w:val="Compact"/>
-              <w:jc w:val="left"/>
-            </w:pPr>
-            <w:r>
-              <w:t xml:space="preserve">2026-09-01 (0d ago)</w:t>
-            </w:r>
-          </w:p>
-        </w:tc>
-      </w:tr>
-    </w:tbl>
-    <w:bookmarkEnd w:id="32"/>
     <w:bookmarkEnd w:id="33"/>
     <w:bookmarkStart w:id="35" w:name="X2dff7e074bc979a9ac1d6152139d744d81c2efa"/>
     <w:p>

</xml_diff>